<commit_message>
rework of website setup
</commit_message>
<xml_diff>
--- a/ChessCamp_Flyer.docx
+++ b/ChessCamp_Flyer.docx
@@ -59,7 +59,7 @@
                 <w:noProof/>
               </w:rPr>
               <w:drawing>
-                <wp:anchor distT="0" distB="0" distL="114300" distR="114300" simplePos="0" relativeHeight="251659264" behindDoc="0" locked="0" layoutInCell="1" allowOverlap="1" wp14:anchorId="2DF21E0E" wp14:editId="34790211">
+                <wp:anchor distT="0" distB="0" distL="114300" distR="114300" simplePos="0" relativeHeight="251659264" behindDoc="0" locked="0" layoutInCell="1" allowOverlap="1" wp14:anchorId="5DE7A2A3" wp14:editId="1A57209B">
                   <wp:simplePos x="0" y="0"/>
                   <wp:positionH relativeFrom="margin">
                     <wp:posOffset>215900</wp:posOffset>
@@ -167,18 +167,7 @@
                 <w:sz w:val="36"/>
                 <w:szCs w:val="36"/>
               </w:rPr>
-              <w:t>KNIGHT4LIFE CHESS</w:t>
-            </w:r>
-            <w:r>
-              <w:rPr>
-                <w:rFonts w:ascii="Arial" w:eastAsia="Arial" w:hAnsi="Arial" w:cs="Arial"/>
-                <w:b/>
-                <w:bCs/>
-                <w:color w:val="C9A83C"/>
-                <w:sz w:val="36"/>
-                <w:szCs w:val="36"/>
-              </w:rPr>
-              <w:t xml:space="preserve"> CAMP</w:t>
+              <w:t>KNIGHT4LIFE CHESS CAMP</w:t>
             </w:r>
             <w:r>
               <w:rPr>
@@ -427,52 +416,7 @@
                 <w:sz w:val="18"/>
                 <w:szCs w:val="18"/>
               </w:rPr>
-              <w:t xml:space="preserve">Student </w:t>
-            </w:r>
-            <w:r>
-              <w:rPr>
-                <w:rFonts w:ascii="Arial" w:eastAsia="Arial" w:hAnsi="Arial" w:cs="Arial"/>
-                <w:color w:val="1A1A1A"/>
-                <w:sz w:val="18"/>
-                <w:szCs w:val="18"/>
-              </w:rPr>
-              <w:t xml:space="preserve">volunteers from high school teams, </w:t>
-            </w:r>
-            <w:r>
-              <w:rPr>
-                <w:rFonts w:ascii="Arial" w:eastAsia="Arial" w:hAnsi="Arial" w:cs="Arial"/>
-                <w:color w:val="1A1A1A"/>
-                <w:sz w:val="18"/>
-                <w:szCs w:val="18"/>
-              </w:rPr>
-              <w:t>coaches</w:t>
-            </w:r>
-            <w:r>
-              <w:rPr>
-                <w:rFonts w:ascii="Arial" w:eastAsia="Arial" w:hAnsi="Arial" w:cs="Arial"/>
-                <w:color w:val="1A1A1A"/>
-                <w:sz w:val="18"/>
-                <w:szCs w:val="18"/>
-              </w:rPr>
-              <w:t xml:space="preserve">, and a guest </w:t>
-            </w:r>
-            <w:r>
-              <w:rPr>
-                <w:rFonts w:ascii="Arial" w:eastAsia="Arial" w:hAnsi="Arial" w:cs="Arial"/>
-                <w:color w:val="1A1A1A"/>
-                <w:sz w:val="18"/>
-                <w:szCs w:val="18"/>
-              </w:rPr>
-              <w:t>titled player</w:t>
-            </w:r>
-            <w:r>
-              <w:rPr>
-                <w:rFonts w:ascii="Arial" w:eastAsia="Arial" w:hAnsi="Arial" w:cs="Arial"/>
-                <w:color w:val="1A1A1A"/>
-                <w:sz w:val="18"/>
-                <w:szCs w:val="18"/>
-              </w:rPr>
-              <w:t xml:space="preserve"> guide every level from beginner to advanced</w:t>
+              <w:t>Student volunteers from high school teams, coaches, and a guest titled player guide every level from beginner to advanced</w:t>
             </w:r>
           </w:p>
         </w:tc>
@@ -536,34 +480,7 @@
                 <w:sz w:val="18"/>
                 <w:szCs w:val="18"/>
               </w:rPr>
-              <w:t xml:space="preserve">Trophies, </w:t>
-            </w:r>
-            <w:r>
-              <w:rPr>
-                <w:rFonts w:ascii="Arial" w:eastAsia="Arial" w:hAnsi="Arial" w:cs="Arial"/>
-                <w:color w:val="1A1A1A"/>
-                <w:sz w:val="18"/>
-                <w:szCs w:val="18"/>
-              </w:rPr>
-              <w:t xml:space="preserve">superlatives, </w:t>
-            </w:r>
-            <w:r>
-              <w:rPr>
-                <w:rFonts w:ascii="Arial" w:eastAsia="Arial" w:hAnsi="Arial" w:cs="Arial"/>
-                <w:color w:val="1A1A1A"/>
-                <w:sz w:val="18"/>
-                <w:szCs w:val="18"/>
-              </w:rPr>
-              <w:t>personalized certificates, camp pins, and prizes all week</w:t>
-            </w:r>
-            <w:r>
-              <w:rPr>
-                <w:rFonts w:ascii="Arial" w:eastAsia="Arial" w:hAnsi="Arial" w:cs="Arial"/>
-                <w:color w:val="1A1A1A"/>
-                <w:sz w:val="18"/>
-                <w:szCs w:val="18"/>
-              </w:rPr>
-              <w:t xml:space="preserve"> for every camper</w:t>
+              <w:t>Trophies, superlatives, personalized certificates, camp pins, and prizes all week for every camper</w:t>
             </w:r>
           </w:p>
         </w:tc>
@@ -1719,61 +1636,7 @@
           <w:sz w:val="18"/>
           <w:szCs w:val="18"/>
         </w:rPr>
-        <w:t xml:space="preserve">Drop-off 9:30 AM  •  Pick-up 2:45 PM  •  Lunch </w:t>
-      </w:r>
-      <w:r>
-        <w:rPr>
-          <w:rFonts w:ascii="Arial" w:eastAsia="Arial" w:hAnsi="Arial" w:cs="Arial"/>
-          <w:color w:val="1A1A1A"/>
-          <w:sz w:val="18"/>
-          <w:szCs w:val="18"/>
-        </w:rPr>
-        <w:t>included</w:t>
-      </w:r>
-      <w:r>
-        <w:rPr>
-          <w:rFonts w:ascii="Arial" w:eastAsia="Arial" w:hAnsi="Arial" w:cs="Arial"/>
-          <w:color w:val="1A1A1A"/>
-          <w:sz w:val="18"/>
-          <w:szCs w:val="18"/>
-        </w:rPr>
-        <w:t xml:space="preserve"> / bring your own </w:t>
-      </w:r>
-      <w:r>
-        <w:rPr>
-          <w:rFonts w:ascii="Arial" w:eastAsia="Arial" w:hAnsi="Arial" w:cs="Arial"/>
-          <w:color w:val="1A1A1A"/>
-          <w:sz w:val="18"/>
-          <w:szCs w:val="18"/>
-        </w:rPr>
-        <w:t xml:space="preserve">(if BYO, contact us </w:t>
-      </w:r>
-      <w:r>
-        <w:rPr>
-          <w:rFonts w:ascii="Arial" w:eastAsia="Arial" w:hAnsi="Arial" w:cs="Arial"/>
-          <w:color w:val="1A1A1A"/>
-          <w:sz w:val="18"/>
-          <w:szCs w:val="18"/>
-        </w:rPr>
-        <w:t>for</w:t>
-      </w:r>
-      <w:r>
-        <w:rPr>
-          <w:rFonts w:ascii="Arial" w:eastAsia="Arial" w:hAnsi="Arial" w:cs="Arial"/>
-          <w:color w:val="1A1A1A"/>
-          <w:sz w:val="18"/>
-          <w:szCs w:val="18"/>
-        </w:rPr>
-        <w:t xml:space="preserve"> lower price)</w:t>
-      </w:r>
-      <w:r>
-        <w:rPr>
-          <w:rFonts w:ascii="Arial" w:eastAsia="Arial" w:hAnsi="Arial" w:cs="Arial"/>
-          <w:color w:val="1A1A1A"/>
-          <w:sz w:val="18"/>
-          <w:szCs w:val="18"/>
-        </w:rPr>
-        <w:t xml:space="preserve"> •  All skill levels welcome</w:t>
+        <w:t xml:space="preserve">Drop-off 9:15-30 AM  •  Pick-up 2:30-45 PM  •  Lunch included / bring your own (if BYO, contact us for lower price) </w:t>
       </w:r>
     </w:p>
     <w:tbl>
@@ -1843,25 +1706,7 @@
                 <w:sz w:val="18"/>
                 <w:szCs w:val="18"/>
               </w:rPr>
-              <w:t>★  Complete beginners</w:t>
-            </w:r>
-            <w:r>
-              <w:rPr>
-                <w:rFonts w:ascii="Arial" w:eastAsia="Arial" w:hAnsi="Arial" w:cs="Arial"/>
-                <w:color w:val="FFFFFF"/>
-                <w:sz w:val="18"/>
-                <w:szCs w:val="18"/>
-              </w:rPr>
-              <w:t xml:space="preserve">: </w:t>
-            </w:r>
-            <w:r>
-              <w:rPr>
-                <w:rFonts w:ascii="Arial" w:eastAsia="Arial" w:hAnsi="Arial" w:cs="Arial"/>
-                <w:color w:val="FFFFFF"/>
-                <w:sz w:val="18"/>
-                <w:szCs w:val="18"/>
-              </w:rPr>
-              <w:t>no experience needed</w:t>
+              <w:t>★  Complete beginners: no experience needed</w:t>
             </w:r>
           </w:p>
           <w:p>
@@ -1949,8 +1794,13 @@
                 <w:sz w:val="18"/>
                 <w:szCs w:val="18"/>
               </w:rPr>
-              <w:t xml:space="preserve">📅  Dates: </w:t>
-            </w:r>
+              <w:t>📅  Dates: July 27-31</w:t>
+            </w:r>
+          </w:p>
+          <w:p>
+            <w:pPr>
+              <w:spacing w:after="40"/>
+            </w:pPr>
             <w:r>
               <w:rPr>
                 <w:rFonts w:ascii="Arial" w:eastAsia="Arial" w:hAnsi="Arial" w:cs="Arial"/>
@@ -1958,7 +1808,7 @@
                 <w:sz w:val="18"/>
                 <w:szCs w:val="18"/>
               </w:rPr>
-              <w:t>July 27-31</w:t>
+              <w:t>⏰  Hours: 9:30 AM – 2:45 PM Daily</w:t>
             </w:r>
           </w:p>
           <w:p>
@@ -1972,13 +1822,10 @@
                 <w:sz w:val="18"/>
                 <w:szCs w:val="18"/>
               </w:rPr>
-              <w:t>⏰  Hours: 9:30 AM – 2:45 PM Daily</w:t>
-            </w:r>
-          </w:p>
-          <w:p>
-            <w:pPr>
-              <w:spacing w:after="40"/>
-            </w:pPr>
+              <w:t>📍  Location: Newport High School</w:t>
+            </w:r>
+          </w:p>
+          <w:p>
             <w:r>
               <w:rPr>
                 <w:rFonts w:ascii="Arial" w:eastAsia="Arial" w:hAnsi="Arial" w:cs="Arial"/>
@@ -1986,45 +1833,7 @@
                 <w:sz w:val="18"/>
                 <w:szCs w:val="18"/>
               </w:rPr>
-              <w:t xml:space="preserve">📍  Location: </w:t>
-            </w:r>
-            <w:r>
-              <w:rPr>
-                <w:rFonts w:ascii="Arial" w:eastAsia="Arial" w:hAnsi="Arial" w:cs="Arial"/>
-                <w:color w:val="1A1A1A"/>
-                <w:sz w:val="18"/>
-                <w:szCs w:val="18"/>
-              </w:rPr>
-              <w:t>Newport High School</w:t>
-            </w:r>
-          </w:p>
-          <w:p>
-            <w:r>
-              <w:rPr>
-                <w:rFonts w:ascii="Arial" w:eastAsia="Arial" w:hAnsi="Arial" w:cs="Arial"/>
-                <w:color w:val="1A1A1A"/>
-                <w:sz w:val="18"/>
-                <w:szCs w:val="18"/>
-              </w:rPr>
-              <w:t xml:space="preserve">💰  Cost: </w:t>
-            </w:r>
-            <w:r>
-              <w:rPr>
-                <w:rFonts w:ascii="Arial" w:eastAsia="Arial" w:hAnsi="Arial" w:cs="Arial"/>
-                <w:color w:val="1A1A1A"/>
-                <w:sz w:val="18"/>
-                <w:szCs w:val="18"/>
-              </w:rPr>
-              <w:t>$299 (Scholarships Apply!)</w:t>
-            </w:r>
-            <w:r>
-              <w:rPr>
-                <w:rFonts w:ascii="Arial" w:eastAsia="Arial" w:hAnsi="Arial" w:cs="Arial"/>
-                <w:color w:val="1A1A1A"/>
-                <w:sz w:val="18"/>
-                <w:szCs w:val="18"/>
-              </w:rPr>
-              <w:t xml:space="preserve"> </w:t>
+              <w:t xml:space="preserve">💰  Cost: $299 (Scholarships Apply!) </w:t>
             </w:r>
           </w:p>
         </w:tc>
@@ -2112,14 +1921,7 @@
                 <w:rFonts w:ascii="Arial" w:eastAsia="Arial" w:hAnsi="Arial" w:cs="Arial"/>
                 <w:color w:val="1A1A1A"/>
               </w:rPr>
-              <w:t>newportchessoutreach@</w:t>
-            </w:r>
-            <w:r>
-              <w:rPr>
-                <w:rFonts w:ascii="Arial" w:eastAsia="Arial" w:hAnsi="Arial" w:cs="Arial"/>
-                <w:color w:val="1A1A1A"/>
-              </w:rPr>
-              <w:t>gmail.com</w:t>
+              <w:t>newportchessoutreach@gmail.com</w:t>
             </w:r>
             <w:r>
               <w:rPr>
@@ -2135,21 +1937,7 @@
                 <w:rFonts w:ascii="Arial" w:eastAsia="Arial" w:hAnsi="Arial" w:cs="Arial"/>
                 <w:color w:val="1A1A1A"/>
               </w:rPr>
-              <w:t>[</w:t>
-            </w:r>
-            <w:r>
-              <w:rPr>
-                <w:rFonts w:ascii="Arial" w:eastAsia="Arial" w:hAnsi="Arial" w:cs="Arial"/>
-                <w:color w:val="1A1A1A"/>
-              </w:rPr>
-              <w:t>www.newportchessoutreach</w:t>
-            </w:r>
-            <w:r>
-              <w:rPr>
-                <w:rFonts w:ascii="Arial" w:eastAsia="Arial" w:hAnsi="Arial" w:cs="Arial"/>
-                <w:color w:val="1A1A1A"/>
-              </w:rPr>
-              <w:t>.org]</w:t>
+              <w:t>[www.newportchessoutreach.org]</w:t>
             </w:r>
           </w:p>
           <w:p>
@@ -2186,21 +1974,7 @@
                 <w:rFonts w:ascii="Arial" w:eastAsia="Arial" w:hAnsi="Arial" w:cs="Arial"/>
                 <w:color w:val="1A1A1A"/>
               </w:rPr>
-              <w:t>[@</w:t>
-            </w:r>
-            <w:r>
-              <w:rPr>
-                <w:rFonts w:ascii="Arial" w:eastAsia="Arial" w:hAnsi="Arial" w:cs="Arial"/>
-                <w:color w:val="1A1A1A"/>
-              </w:rPr>
-              <w:t>newportchessoutreach</w:t>
-            </w:r>
-            <w:r>
-              <w:rPr>
-                <w:rFonts w:ascii="Arial" w:eastAsia="Arial" w:hAnsi="Arial" w:cs="Arial"/>
-                <w:color w:val="1A1A1A"/>
-              </w:rPr>
-              <w:t>]</w:t>
+              <w:t>[@newportchessoutreach]</w:t>
             </w:r>
           </w:p>
         </w:tc>
@@ -2267,17 +2041,14 @@
       </w:tr>
     </w:tbl>
     <w:p/>
-    <w:p/>
-    <w:p/>
-    <w:p/>
-    <w:p/>
-    <w:p/>
-    <w:p/>
-    <w:p/>
-    <w:p/>
-    <w:p/>
-    <w:p/>
-    <w:p/>
+    <w:p>
+      <w:pPr>
+        <w:spacing w:after="160" w:line="278" w:lineRule="auto"/>
+      </w:pPr>
+      <w:r>
+        <w:br w:type="page"/>
+      </w:r>
+    </w:p>
     <w:p>
       <w:r>
         <w:rPr>
@@ -2583,6 +2354,7 @@
     </w:p>
     <w:p>
       <w:r>
+        <w:lastRenderedPageBreak/>
         <w:t>12:45–1:30 | Bughouse Bonanza</w:t>
       </w:r>
     </w:p>
@@ -2618,7 +2390,6 @@
     </w:p>
     <w:p>
       <w:r>
-        <w:lastRenderedPageBreak/>
         <w:t>Week-long puzzle challenge introduced</w:t>
       </w:r>
     </w:p>
@@ -2889,6 +2660,7 @@
     </w:p>
     <w:p>
       <w:r>
+        <w:lastRenderedPageBreak/>
         <w:t> </w:t>
       </w:r>
     </w:p>
@@ -2960,7 +2732,6 @@
     </w:p>
     <w:p>
       <w:r>
-        <w:lastRenderedPageBreak/>
         <w:t> </w:t>
       </w:r>
     </w:p>
@@ -3152,9 +2923,11 @@
       </w:r>
     </w:p>
     <w:p/>
+    <w:p/>
+    <w:p/>
     <w:sectPr>
       <w:pgSz w:w="12240" w:h="15840"/>
-      <w:pgMar w:top="720" w:right="720" w:bottom="720" w:left="720" w:header="708" w:footer="708" w:gutter="0"/>
+      <w:pgMar w:top="1440" w:right="1440" w:bottom="1440" w:left="1440" w:header="720" w:footer="720" w:gutter="0"/>
       <w:cols w:space="720"/>
       <w:docGrid w:linePitch="360"/>
     </w:sectPr>

</xml_diff>